<commit_message>
Added instructions to question docs
</commit_message>
<xml_diff>
--- a/survey_material/questions_survey_expert.docx
+++ b/survey_material/questions_survey_expert.docx
@@ -13,19 +13,369 @@
         <w:rPr>
           <w:lang w:val="en-US"/>
         </w:rPr>
-        <w:t xml:space="preserve">Questions &amp; Answer Options </w:t>
-      </w:r>
-      <w:r>
-        <w:rPr>
-          <w:lang w:val="en-US"/>
-        </w:rPr>
-        <w:t xml:space="preserve">Expert </w:t>
-      </w:r>
-      <w:r>
-        <w:rPr>
-          <w:lang w:val="en-US"/>
-        </w:rPr>
-        <w:t>Survey</w:t>
+        <w:t>Questions &amp; Answer Options Expert Survey</w:t>
+      </w:r>
+    </w:p>
+    <w:p>
+      <w:pPr>
+        <w:pStyle w:val="Heading1"/>
+        <w:rPr>
+          <w:lang w:val="en-US"/>
+        </w:rPr>
+      </w:pPr>
+      <w:r>
+        <w:rPr>
+          <w:lang w:val="en-US"/>
+        </w:rPr>
+        <w:t>Website task instructions</w:t>
+      </w:r>
+    </w:p>
+    <w:p>
+      <w:pPr>
+        <w:pStyle w:val="ListParagraph"/>
+        <w:numPr>
+          <w:ilvl w:val="0"/>
+          <w:numId w:val="3"/>
+        </w:numPr>
+        <w:rPr>
+          <w:lang w:val="en-US"/>
+        </w:rPr>
+      </w:pPr>
+      <w:r>
+        <w:rPr>
+          <w:lang w:val="en-US"/>
+        </w:rPr>
+        <w:t>In this survey, we ask you to assume a future scenario where different digital credentials exist and can be sent to with websites easily.</w:t>
+      </w:r>
+    </w:p>
+    <w:p>
+      <w:pPr>
+        <w:pStyle w:val="ListParagraph"/>
+        <w:numPr>
+          <w:ilvl w:val="0"/>
+          <w:numId w:val="3"/>
+        </w:numPr>
+        <w:rPr>
+          <w:lang w:val="en-US"/>
+        </w:rPr>
+      </w:pPr>
+      <w:r>
+        <w:rPr>
+          <w:lang w:val="en-US"/>
+        </w:rPr>
+        <w:t>An example of such a system would be the proposed</w:t>
+      </w:r>
+      <w:r>
+        <w:rPr>
+          <w:lang w:val="en-US"/>
+        </w:rPr>
+        <w:t xml:space="preserve"> EUDI Wallet.</w:t>
+      </w:r>
+    </w:p>
+    <w:p>
+      <w:pPr>
+        <w:pStyle w:val="ListParagraph"/>
+        <w:numPr>
+          <w:ilvl w:val="0"/>
+          <w:numId w:val="3"/>
+        </w:numPr>
+        <w:rPr>
+          <w:lang w:val="en-US"/>
+        </w:rPr>
+      </w:pPr>
+      <w:r>
+        <w:rPr>
+          <w:lang w:val="en-US"/>
+        </w:rPr>
+        <w:t>During the survey, you will evaluate whether it is</w:t>
+      </w:r>
+      <w:r>
+        <w:rPr>
+          <w:lang w:val="en-US"/>
+        </w:rPr>
+        <w:t xml:space="preserve"> </w:t>
+      </w:r>
+      <w:r>
+        <w:rPr>
+          <w:lang w:val="en-US"/>
+        </w:rPr>
+        <w:t>necessary or beneficial to provide specific credentials to different websites.</w:t>
+      </w:r>
+    </w:p>
+    <w:p>
+      <w:pPr>
+        <w:pStyle w:val="ListParagraph"/>
+        <w:numPr>
+          <w:ilvl w:val="0"/>
+          <w:numId w:val="3"/>
+        </w:numPr>
+        <w:rPr>
+          <w:lang w:val="en-US"/>
+        </w:rPr>
+      </w:pPr>
+      <w:r>
+        <w:rPr>
+          <w:lang w:val="en-US"/>
+        </w:rPr>
+        <w:t>You will be asked to consider several credentials, for example</w:t>
+      </w:r>
+      <w:r>
+        <w:rPr>
+          <w:lang w:val="en-US"/>
+        </w:rPr>
+        <w:t xml:space="preserve"> [list of 5 credential names]</w:t>
+      </w:r>
+    </w:p>
+    <w:p>
+      <w:pPr>
+        <w:pStyle w:val="ListParagraph"/>
+        <w:numPr>
+          <w:ilvl w:val="0"/>
+          <w:numId w:val="3"/>
+        </w:numPr>
+        <w:rPr>
+          <w:lang w:val="en-US"/>
+        </w:rPr>
+      </w:pPr>
+      <w:r>
+        <w:rPr>
+          <w:lang w:val="en-US"/>
+        </w:rPr>
+        <w:t>Each of those credentials has a set of attributes that can be transmitted to the website.</w:t>
+      </w:r>
+    </w:p>
+    <w:p>
+      <w:pPr>
+        <w:pStyle w:val="ListParagraph"/>
+        <w:numPr>
+          <w:ilvl w:val="0"/>
+          <w:numId w:val="3"/>
+        </w:numPr>
+        <w:rPr>
+          <w:lang w:val="en-US"/>
+        </w:rPr>
+      </w:pPr>
+      <w:r>
+        <w:rPr>
+          <w:lang w:val="en-US"/>
+        </w:rPr>
+        <w:t>You will see the different credentials and attributes in a sidebar during the task.</w:t>
+      </w:r>
+    </w:p>
+    <w:p>
+      <w:pPr>
+        <w:pStyle w:val="ListParagraph"/>
+        <w:numPr>
+          <w:ilvl w:val="0"/>
+          <w:numId w:val="3"/>
+        </w:numPr>
+        <w:rPr>
+          <w:lang w:val="en-US"/>
+        </w:rPr>
+      </w:pPr>
+      <w:r>
+        <w:rPr>
+          <w:lang w:val="en-US"/>
+        </w:rPr>
+        <w:t>For example, the visa credential has the following attributes</w:t>
+      </w:r>
+      <w:r>
+        <w:rPr>
+          <w:lang w:val="en-US"/>
+        </w:rPr>
+        <w:t xml:space="preserve"> [image of the visa credential with attributes]</w:t>
+      </w:r>
+    </w:p>
+    <w:p>
+      <w:pPr>
+        <w:pStyle w:val="ListParagraph"/>
+        <w:numPr>
+          <w:ilvl w:val="0"/>
+          <w:numId w:val="3"/>
+        </w:numPr>
+        <w:rPr>
+          <w:lang w:val="en-US"/>
+        </w:rPr>
+      </w:pPr>
+      <w:r>
+        <w:rPr>
+          <w:lang w:val="en-US"/>
+        </w:rPr>
+        <w:t>Please consider only the shown attributes when responding to the survey questions, even if the equivalent real-world document has different attributes.</w:t>
+      </w:r>
+    </w:p>
+    <w:p>
+      <w:pPr>
+        <w:pStyle w:val="ListParagraph"/>
+        <w:numPr>
+          <w:ilvl w:val="0"/>
+          <w:numId w:val="3"/>
+        </w:numPr>
+        <w:rPr>
+          <w:lang w:val="en-US"/>
+        </w:rPr>
+      </w:pPr>
+      <w:r>
+        <w:rPr>
+          <w:lang w:val="en-US"/>
+        </w:rPr>
+        <w:t>During the survey, you will see different websites with their URLs and some additional information about the website.</w:t>
+      </w:r>
+    </w:p>
+    <w:p>
+      <w:pPr>
+        <w:pStyle w:val="ListParagraph"/>
+        <w:numPr>
+          <w:ilvl w:val="0"/>
+          <w:numId w:val="3"/>
+        </w:numPr>
+        <w:rPr>
+          <w:lang w:val="en-US"/>
+        </w:rPr>
+      </w:pPr>
+      <w:r>
+        <w:rPr>
+          <w:lang w:val="en-US"/>
+        </w:rPr>
+        <w:t>For each website, you will be asked to evaluate the following:</w:t>
+      </w:r>
+    </w:p>
+    <w:p>
+      <w:pPr>
+        <w:pStyle w:val="ListParagraph"/>
+        <w:numPr>
+          <w:ilvl w:val="0"/>
+          <w:numId w:val="3"/>
+        </w:numPr>
+        <w:rPr>
+          <w:lang w:val="en-US"/>
+        </w:rPr>
+      </w:pPr>
+      <w:r>
+        <w:rPr>
+          <w:lang w:val="en-US"/>
+        </w:rPr>
+        <w:t xml:space="preserve">[Law] </w:t>
+      </w:r>
+      <w:r>
+        <w:rPr>
+          <w:lang w:val="en-US"/>
+        </w:rPr>
+        <w:t>Which credentials does the website require for legal purposes or legitimate interest.</w:t>
+      </w:r>
+      <w:r>
+        <w:rPr>
+          <w:lang w:val="en-US"/>
+        </w:rPr>
+        <w:t xml:space="preserve"> </w:t>
+      </w:r>
+    </w:p>
+    <w:p>
+      <w:pPr>
+        <w:pStyle w:val="ListParagraph"/>
+        <w:numPr>
+          <w:ilvl w:val="0"/>
+          <w:numId w:val="3"/>
+        </w:numPr>
+        <w:rPr>
+          <w:lang w:val="en-US"/>
+        </w:rPr>
+      </w:pPr>
+      <w:r>
+        <w:rPr>
+          <w:lang w:val="en-US"/>
+        </w:rPr>
+        <w:t>[Cybersecurity]</w:t>
+      </w:r>
+      <w:r>
+        <w:rPr>
+          <w:lang w:val="en-US"/>
+        </w:rPr>
+        <w:t xml:space="preserve"> </w:t>
+      </w:r>
+      <w:r>
+        <w:rPr>
+          <w:lang w:val="en-US"/>
+        </w:rPr>
+        <w:t>Which credentials should never be requested by the website from a cybersecurity perspective.</w:t>
+      </w:r>
+    </w:p>
+    <w:p>
+      <w:pPr>
+        <w:pStyle w:val="ListParagraph"/>
+        <w:numPr>
+          <w:ilvl w:val="0"/>
+          <w:numId w:val="3"/>
+        </w:numPr>
+        <w:rPr>
+          <w:lang w:val="en-US"/>
+        </w:rPr>
+      </w:pPr>
+      <w:r>
+        <w:rPr>
+          <w:lang w:val="en-US"/>
+        </w:rPr>
+        <w:t xml:space="preserve">[Policy] </w:t>
+      </w:r>
+      <w:r>
+        <w:rPr>
+          <w:lang w:val="en-US"/>
+        </w:rPr>
+        <w:t>Which credentials should</w:t>
+      </w:r>
+      <w:r>
+        <w:rPr>
+          <w:lang w:val="en-US"/>
+        </w:rPr>
+        <w:t xml:space="preserve"> </w:t>
+      </w:r>
+      <w:r>
+        <w:rPr>
+          <w:lang w:val="en-US"/>
+        </w:rPr>
+        <w:t>never be requested by the website from a policy perspective.</w:t>
+      </w:r>
+    </w:p>
+    <w:p>
+      <w:pPr>
+        <w:pStyle w:val="ListParagraph"/>
+        <w:numPr>
+          <w:ilvl w:val="0"/>
+          <w:numId w:val="3"/>
+        </w:numPr>
+        <w:rPr>
+          <w:lang w:val="en-US"/>
+        </w:rPr>
+      </w:pPr>
+      <w:r>
+        <w:rPr>
+          <w:lang w:val="en-US"/>
+        </w:rPr>
+        <w:t xml:space="preserve">[Ethics] </w:t>
+      </w:r>
+      <w:r>
+        <w:rPr>
+          <w:lang w:val="en-US"/>
+        </w:rPr>
+        <w:t>Which credentials should never be requested by the website from an ethical perspective.</w:t>
+      </w:r>
+    </w:p>
+    <w:p>
+      <w:pPr>
+        <w:pStyle w:val="ListParagraph"/>
+        <w:numPr>
+          <w:ilvl w:val="0"/>
+          <w:numId w:val="3"/>
+        </w:numPr>
+        <w:rPr>
+          <w:lang w:val="en-US"/>
+        </w:rPr>
+      </w:pPr>
+      <w:r>
+        <w:rPr>
+          <w:lang w:val="en-US"/>
+        </w:rPr>
+        <w:t>Which credentials could enhance the functionality or user experience of the website?</w:t>
       </w:r>
     </w:p>
     <w:p>
@@ -57,6 +407,66 @@
         <w:rPr>
           <w:lang w:val="en-US"/>
         </w:rPr>
+        <w:t>Website information with: name, URL, description, category, company HQ, size</w:t>
+      </w:r>
+    </w:p>
+    <w:p>
+      <w:pPr>
+        <w:pStyle w:val="ListParagraph"/>
+        <w:numPr>
+          <w:ilvl w:val="0"/>
+          <w:numId w:val="1"/>
+        </w:numPr>
+        <w:rPr>
+          <w:lang w:val="en-US"/>
+        </w:rPr>
+      </w:pPr>
+      <w:r>
+        <w:rPr>
+          <w:lang w:val="en-US"/>
+        </w:rPr>
+        <w:t>Please assume that this is a future version of this website that has all the described functionality.</w:t>
+      </w:r>
+    </w:p>
+    <w:p>
+      <w:pPr>
+        <w:pStyle w:val="ListParagraph"/>
+        <w:numPr>
+          <w:ilvl w:val="0"/>
+          <w:numId w:val="1"/>
+        </w:numPr>
+        <w:rPr>
+          <w:lang w:val="en-US"/>
+        </w:rPr>
+      </w:pPr>
+      <w:r>
+        <w:rPr>
+          <w:lang w:val="en-US"/>
+        </w:rPr>
+        <w:t xml:space="preserve">For non-EU websites: </w:t>
+      </w:r>
+      <w:r>
+        <w:rPr>
+          <w:lang w:val="en-US"/>
+        </w:rPr>
+        <w:t>-- Operates under EU law or using an EU subsidiary</w:t>
+      </w:r>
+    </w:p>
+    <w:p>
+      <w:pPr>
+        <w:pStyle w:val="ListParagraph"/>
+        <w:numPr>
+          <w:ilvl w:val="0"/>
+          <w:numId w:val="1"/>
+        </w:numPr>
+        <w:rPr>
+          <w:lang w:val="en-US"/>
+        </w:rPr>
+      </w:pPr>
+      <w:r>
+        <w:rPr>
+          <w:lang w:val="en-US"/>
+        </w:rPr>
         <w:t xml:space="preserve">[Law] </w:t>
       </w:r>
       <w:r>
@@ -91,9 +501,6 @@
           <w:ilvl w:val="0"/>
           <w:numId w:val="1"/>
         </w:numPr>
-        <w:rPr>
-          <w:lang w:val="en-CH"/>
-        </w:rPr>
       </w:pPr>
       <w:r>
         <w:rPr>
@@ -102,9 +509,6 @@
         <w:t xml:space="preserve">[cybersecurity] </w:t>
       </w:r>
       <w:r>
-        <w:rPr>
-          <w:lang w:val="en-CH"/>
-        </w:rPr>
         <w:t>In your opinion, which of the credentials should never be sent to this website from a cybersecurity perspective? (Please choose all that apply)</w:t>
       </w:r>
     </w:p>
@@ -141,6 +545,7 @@
         <w:rPr>
           <w:lang w:val="en-US"/>
         </w:rPr>
+        <w:lastRenderedPageBreak/>
         <w:t xml:space="preserve">[policy] </w:t>
       </w:r>
       <w:r>
@@ -217,9 +622,6 @@
           <w:ilvl w:val="0"/>
           <w:numId w:val="1"/>
         </w:numPr>
-        <w:rPr>
-          <w:lang w:val="en-CH"/>
-        </w:rPr>
       </w:pPr>
       <w:r>
         <w:rPr>
@@ -228,9 +630,6 @@
         <w:t xml:space="preserve">[all] </w:t>
       </w:r>
       <w:r>
-        <w:rPr>
-          <w:lang w:val="en-CH"/>
-        </w:rPr>
         <w:t>You may be able to benefit more from this website's services by providing additional credentials to this website. Which of the credentials (that you did not choose in the previous question) would sufficiently enhance the services of this website, such that you would be willing to provide them? (Please choose all that apply)</w:t>
       </w:r>
     </w:p>
@@ -266,6 +665,119 @@
 <file path=word/numbering.xml><?xml version="1.0" encoding="utf-8"?>
 <w:numbering xmlns:wpc="http://schemas.microsoft.com/office/word/2010/wordprocessingCanvas" xmlns:cx="http://schemas.microsoft.com/office/drawing/2014/chartex" xmlns:cx1="http://schemas.microsoft.com/office/drawing/2015/9/8/chartex" xmlns:cx2="http://schemas.microsoft.com/office/drawing/2015/10/21/chartex" xmlns:cx3="http://schemas.microsoft.com/office/drawing/2016/5/9/chartex" xmlns:cx4="http://schemas.microsoft.com/office/drawing/2016/5/10/chartex" xmlns:cx5="http://schemas.microsoft.com/office/drawing/2016/5/11/chartex" xmlns:cx6="http://schemas.microsoft.com/office/drawing/2016/5/12/chartex" xmlns:cx7="http://schemas.microsoft.com/office/drawing/2016/5/13/chartex" xmlns:cx8="http://schemas.microsoft.com/office/drawing/2016/5/14/chartex" xmlns:mc="http://schemas.openxmlformats.org/markup-compatibility/2006" xmlns:aink="http://schemas.microsoft.com/office/drawing/2016/ink" xmlns:am3d="http://schemas.microsoft.com/office/drawing/2017/model3d" xmlns:o="urn:schemas-microsoft-com:office:office" xmlns:oel="http://schemas.microsoft.com/office/2019/extlst" xmlns:r="http://schemas.openxmlformats.org/officeDocument/2006/relationships" xmlns:m="http://schemas.openxmlformats.org/officeDocument/2006/math" xmlns:v="urn:schemas-microsoft-com:vml" xmlns:wp14="http://schemas.microsoft.com/office/word/2010/wordprocessingDrawing" xmlns:wp="http://schemas.openxmlformats.org/drawingml/2006/wordprocessingDrawing" xmlns:w10="urn:schemas-microsoft-com:office:word" xmlns:w="http://schemas.openxmlformats.org/wordprocessingml/2006/main" xmlns:w14="http://schemas.microsoft.com/office/word/2010/wordml" xmlns:w15="http://schemas.microsoft.com/office/word/2012/wordml" xmlns:w16cex="http://schemas.microsoft.com/office/word/2018/wordml/cex" xmlns:w16cid="http://schemas.microsoft.com/office/word/2016/wordml/cid" xmlns:w16="http://schemas.microsoft.com/office/word/2018/wordml" xmlns:w16du="http://schemas.microsoft.com/office/word/2023/wordml/word16du" xmlns:w16sdtdh="http://schemas.microsoft.com/office/word/2020/wordml/sdtdatahash" xmlns:w16sdtfl="http://schemas.microsoft.com/office/word/2024/wordml/sdtformatlock" xmlns:w16se="http://schemas.microsoft.com/office/word/2015/wordml/symex" xmlns:wpg="http://schemas.microsoft.com/office/word/2010/wordprocessingGroup" xmlns:wpi="http://schemas.microsoft.com/office/word/2010/wordprocessingInk" xmlns:wne="http://schemas.microsoft.com/office/word/2006/wordml" xmlns:wps="http://schemas.microsoft.com/office/word/2010/wordprocessingShape" mc:Ignorable="w14 w15 w16se w16cid w16 w16cex w16sdtdh w16sdtfl w16du wp14">
   <w:abstractNum w:abstractNumId="0" w15:restartNumberingAfterBreak="0">
+    <w:nsid w:val="05E0138E"/>
+    <w:multiLevelType w:val="hybridMultilevel"/>
+    <w:tmpl w:val="E80EF2A2"/>
+    <w:lvl w:ilvl="0" w:tplc="20000001">
+      <w:start w:val="1"/>
+      <w:numFmt w:val="bullet"/>
+      <w:lvlText w:val=""/>
+      <w:lvlJc w:val="left"/>
+      <w:pPr>
+        <w:ind w:left="720" w:hanging="360"/>
+      </w:pPr>
+      <w:rPr>
+        <w:rFonts w:ascii="Symbol" w:hAnsi="Symbol" w:hint="default"/>
+      </w:rPr>
+    </w:lvl>
+    <w:lvl w:ilvl="1" w:tplc="20000003" w:tentative="1">
+      <w:start w:val="1"/>
+      <w:numFmt w:val="bullet"/>
+      <w:lvlText w:val="o"/>
+      <w:lvlJc w:val="left"/>
+      <w:pPr>
+        <w:ind w:left="1440" w:hanging="360"/>
+      </w:pPr>
+      <w:rPr>
+        <w:rFonts w:ascii="Courier New" w:hAnsi="Courier New" w:cs="Courier New" w:hint="default"/>
+      </w:rPr>
+    </w:lvl>
+    <w:lvl w:ilvl="2" w:tplc="20000005" w:tentative="1">
+      <w:start w:val="1"/>
+      <w:numFmt w:val="bullet"/>
+      <w:lvlText w:val=""/>
+      <w:lvlJc w:val="left"/>
+      <w:pPr>
+        <w:ind w:left="2160" w:hanging="360"/>
+      </w:pPr>
+      <w:rPr>
+        <w:rFonts w:ascii="Wingdings" w:hAnsi="Wingdings" w:hint="default"/>
+      </w:rPr>
+    </w:lvl>
+    <w:lvl w:ilvl="3" w:tplc="20000001" w:tentative="1">
+      <w:start w:val="1"/>
+      <w:numFmt w:val="bullet"/>
+      <w:lvlText w:val=""/>
+      <w:lvlJc w:val="left"/>
+      <w:pPr>
+        <w:ind w:left="2880" w:hanging="360"/>
+      </w:pPr>
+      <w:rPr>
+        <w:rFonts w:ascii="Symbol" w:hAnsi="Symbol" w:hint="default"/>
+      </w:rPr>
+    </w:lvl>
+    <w:lvl w:ilvl="4" w:tplc="20000003" w:tentative="1">
+      <w:start w:val="1"/>
+      <w:numFmt w:val="bullet"/>
+      <w:lvlText w:val="o"/>
+      <w:lvlJc w:val="left"/>
+      <w:pPr>
+        <w:ind w:left="3600" w:hanging="360"/>
+      </w:pPr>
+      <w:rPr>
+        <w:rFonts w:ascii="Courier New" w:hAnsi="Courier New" w:cs="Courier New" w:hint="default"/>
+      </w:rPr>
+    </w:lvl>
+    <w:lvl w:ilvl="5" w:tplc="20000005" w:tentative="1">
+      <w:start w:val="1"/>
+      <w:numFmt w:val="bullet"/>
+      <w:lvlText w:val=""/>
+      <w:lvlJc w:val="left"/>
+      <w:pPr>
+        <w:ind w:left="4320" w:hanging="360"/>
+      </w:pPr>
+      <w:rPr>
+        <w:rFonts w:ascii="Wingdings" w:hAnsi="Wingdings" w:hint="default"/>
+      </w:rPr>
+    </w:lvl>
+    <w:lvl w:ilvl="6" w:tplc="20000001" w:tentative="1">
+      <w:start w:val="1"/>
+      <w:numFmt w:val="bullet"/>
+      <w:lvlText w:val=""/>
+      <w:lvlJc w:val="left"/>
+      <w:pPr>
+        <w:ind w:left="5040" w:hanging="360"/>
+      </w:pPr>
+      <w:rPr>
+        <w:rFonts w:ascii="Symbol" w:hAnsi="Symbol" w:hint="default"/>
+      </w:rPr>
+    </w:lvl>
+    <w:lvl w:ilvl="7" w:tplc="20000003" w:tentative="1">
+      <w:start w:val="1"/>
+      <w:numFmt w:val="bullet"/>
+      <w:lvlText w:val="o"/>
+      <w:lvlJc w:val="left"/>
+      <w:pPr>
+        <w:ind w:left="5760" w:hanging="360"/>
+      </w:pPr>
+      <w:rPr>
+        <w:rFonts w:ascii="Courier New" w:hAnsi="Courier New" w:cs="Courier New" w:hint="default"/>
+      </w:rPr>
+    </w:lvl>
+    <w:lvl w:ilvl="8" w:tplc="20000005" w:tentative="1">
+      <w:start w:val="1"/>
+      <w:numFmt w:val="bullet"/>
+      <w:lvlText w:val=""/>
+      <w:lvlJc w:val="left"/>
+      <w:pPr>
+        <w:ind w:left="6480" w:hanging="360"/>
+      </w:pPr>
+      <w:rPr>
+        <w:rFonts w:ascii="Wingdings" w:hAnsi="Wingdings" w:hint="default"/>
+      </w:rPr>
+    </w:lvl>
+  </w:abstractNum>
+  <w:abstractNum w:abstractNumId="1" w15:restartNumberingAfterBreak="0">
     <w:nsid w:val="31913F12"/>
     <w:multiLevelType w:val="hybridMultilevel"/>
     <w:tmpl w:val="CCECFE34"/>
@@ -375,7 +887,123 @@
       </w:rPr>
     </w:lvl>
   </w:abstractNum>
+  <w:abstractNum w:abstractNumId="2" w15:restartNumberingAfterBreak="0">
+    <w:nsid w:val="7D487422"/>
+    <w:multiLevelType w:val="hybridMultilevel"/>
+    <w:tmpl w:val="EEDCFD1E"/>
+    <w:lvl w:ilvl="0" w:tplc="20000001">
+      <w:start w:val="1"/>
+      <w:numFmt w:val="bullet"/>
+      <w:lvlText w:val=""/>
+      <w:lvlJc w:val="left"/>
+      <w:pPr>
+        <w:ind w:left="720" w:hanging="360"/>
+      </w:pPr>
+      <w:rPr>
+        <w:rFonts w:ascii="Symbol" w:hAnsi="Symbol" w:hint="default"/>
+      </w:rPr>
+    </w:lvl>
+    <w:lvl w:ilvl="1" w:tplc="2000000F">
+      <w:start w:val="1"/>
+      <w:numFmt w:val="decimal"/>
+      <w:lvlText w:val="%2."/>
+      <w:lvlJc w:val="left"/>
+      <w:pPr>
+        <w:ind w:left="1440" w:hanging="360"/>
+      </w:pPr>
+    </w:lvl>
+    <w:lvl w:ilvl="2" w:tplc="20000005" w:tentative="1">
+      <w:start w:val="1"/>
+      <w:numFmt w:val="bullet"/>
+      <w:lvlText w:val=""/>
+      <w:lvlJc w:val="left"/>
+      <w:pPr>
+        <w:ind w:left="2160" w:hanging="360"/>
+      </w:pPr>
+      <w:rPr>
+        <w:rFonts w:ascii="Wingdings" w:hAnsi="Wingdings" w:hint="default"/>
+      </w:rPr>
+    </w:lvl>
+    <w:lvl w:ilvl="3" w:tplc="20000001" w:tentative="1">
+      <w:start w:val="1"/>
+      <w:numFmt w:val="bullet"/>
+      <w:lvlText w:val=""/>
+      <w:lvlJc w:val="left"/>
+      <w:pPr>
+        <w:ind w:left="2880" w:hanging="360"/>
+      </w:pPr>
+      <w:rPr>
+        <w:rFonts w:ascii="Symbol" w:hAnsi="Symbol" w:hint="default"/>
+      </w:rPr>
+    </w:lvl>
+    <w:lvl w:ilvl="4" w:tplc="20000003" w:tentative="1">
+      <w:start w:val="1"/>
+      <w:numFmt w:val="bullet"/>
+      <w:lvlText w:val="o"/>
+      <w:lvlJc w:val="left"/>
+      <w:pPr>
+        <w:ind w:left="3600" w:hanging="360"/>
+      </w:pPr>
+      <w:rPr>
+        <w:rFonts w:ascii="Courier New" w:hAnsi="Courier New" w:cs="Courier New" w:hint="default"/>
+      </w:rPr>
+    </w:lvl>
+    <w:lvl w:ilvl="5" w:tplc="20000005" w:tentative="1">
+      <w:start w:val="1"/>
+      <w:numFmt w:val="bullet"/>
+      <w:lvlText w:val=""/>
+      <w:lvlJc w:val="left"/>
+      <w:pPr>
+        <w:ind w:left="4320" w:hanging="360"/>
+      </w:pPr>
+      <w:rPr>
+        <w:rFonts w:ascii="Wingdings" w:hAnsi="Wingdings" w:hint="default"/>
+      </w:rPr>
+    </w:lvl>
+    <w:lvl w:ilvl="6" w:tplc="20000001" w:tentative="1">
+      <w:start w:val="1"/>
+      <w:numFmt w:val="bullet"/>
+      <w:lvlText w:val=""/>
+      <w:lvlJc w:val="left"/>
+      <w:pPr>
+        <w:ind w:left="5040" w:hanging="360"/>
+      </w:pPr>
+      <w:rPr>
+        <w:rFonts w:ascii="Symbol" w:hAnsi="Symbol" w:hint="default"/>
+      </w:rPr>
+    </w:lvl>
+    <w:lvl w:ilvl="7" w:tplc="20000003" w:tentative="1">
+      <w:start w:val="1"/>
+      <w:numFmt w:val="bullet"/>
+      <w:lvlText w:val="o"/>
+      <w:lvlJc w:val="left"/>
+      <w:pPr>
+        <w:ind w:left="5760" w:hanging="360"/>
+      </w:pPr>
+      <w:rPr>
+        <w:rFonts w:ascii="Courier New" w:hAnsi="Courier New" w:cs="Courier New" w:hint="default"/>
+      </w:rPr>
+    </w:lvl>
+    <w:lvl w:ilvl="8" w:tplc="20000005" w:tentative="1">
+      <w:start w:val="1"/>
+      <w:numFmt w:val="bullet"/>
+      <w:lvlText w:val=""/>
+      <w:lvlJc w:val="left"/>
+      <w:pPr>
+        <w:ind w:left="6480" w:hanging="360"/>
+      </w:pPr>
+      <w:rPr>
+        <w:rFonts w:ascii="Wingdings" w:hAnsi="Wingdings" w:hint="default"/>
+      </w:rPr>
+    </w:lvl>
+  </w:abstractNum>
   <w:num w:numId="1" w16cid:durableId="1486701763">
+    <w:abstractNumId w:val="1"/>
+  </w:num>
+  <w:num w:numId="2" w16cid:durableId="1228804159">
+    <w:abstractNumId w:val="2"/>
+  </w:num>
+  <w:num w:numId="3" w16cid:durableId="993727665">
     <w:abstractNumId w:val="0"/>
   </w:num>
 </w:numbering>
@@ -984,6 +1612,7 @@
   <w:style w:type="character" w:default="1" w:styleId="DefaultParagraphFont">
     <w:name w:val="Default Paragraph Font"/>
     <w:uiPriority w:val="1"/>
+    <w:semiHidden/>
     <w:unhideWhenUsed/>
   </w:style>
   <w:style w:type="table" w:default="1" w:styleId="TableNormal">

</xml_diff>